<commit_message>
fix(cad): alias Spreadsheet bukan nama satuan di Modul 7, 10, 11, 14
Co-Authored-By: Claude Sonnet 5.5 <noreply@anthropic.com>
</commit_message>
<xml_diff>
--- a/Pemodelan-Computer-Aided-Design/Modul-Word/Modul-14-Optimasi-Desain-untuk-Efisiensi-dan-Lingkungan.docx
+++ b/Pemodelan-Computer-Aided-Design/Modul-Word/Modul-14-Optimasi-Desain-untuk-Efisiensi-dan-Lingkungan.docx
@@ -4561,7 +4561,7 @@
           <w:i w:val="0"/>
           <w:sz w:val="20"/>
         </w:rPr>
-        <w:t>Gambar 2 — Spreadsheet beralias mengendalikan geometri lewat ekspresi. Sel V0, r, h, dan A diberi alias; radius sketsa dan panjang Pad mengambil nilainya lewat ekspresi =Spreadsheet.r dan =Spreadsheet.h. Mengubah V₀ menghitung ulang seluruh model, dan Shape.Area langsung memberi luas minimum 34.873,42 mm².</w:t>
+        <w:t>Gambar 2 — Spreadsheet beralias mengendalikan geometri lewat ekspresi. Sel V0, r, tinggi, dan luas diberi alias; radius sketsa dan panjang Pad mengambil nilainya lewat ekspresi =Spreadsheet.r dan =Spreadsheet.tinggi. (Jangan memakai h atau A sebagai alias: FreeCAD menolaknya karena sama dengan satuan jam dan ampere.) Mengubah V₀ menghitung ulang seluruh model, dan Shape.Area langsung memberi luas minimum 34.873,42 mm².</w:t>
       </w:r>
     </w:p>
     <w:p>
@@ -6129,7 +6129,7 @@
           <w:i w:val="0"/>
           <w:sz w:val="21"/>
         </w:rPr>
-        <w:t xml:space="preserve"> membaca properti fitur yang bergantung pada sel itu sendiri (mis. Pad.Length yang sudah terikat =Spreadsheet.h). FreeCAD akan menolak dengan pesan </w:t>
+        <w:t xml:space="preserve"> membaca properti fitur yang bergantung pada sel itu sendiri (mis. Pad.Length yang sudah terikat =Spreadsheet.tinggi). FreeCAD akan menolak dengan pesan </w:t>
       </w:r>
       <w:r>
         <w:rPr>
@@ -12123,7 +12123,7 @@
           <w:i w:val="0"/>
           <w:sz w:val="21"/>
         </w:rPr>
-        <w:t xml:space="preserve"> jangan membuat tiga dokumen terpisah. Buat satu Spreadsheet berisi alias E, rho, f_co2, lalu tiga kolom nilai untuk baja pejal, baja berusuk, dan aluminium; sel h, massa, dan CO2 menghitung ketiganya berdampingan. Model 3D cukup dibuat untuk alternatif yang menang, sedangkan dua lainnya cukup diwakili angka di Spreadsheet — itulah gunanya model parametrik: alternatif dievaluasi tanpa harus digambar semuanya.</w:t>
+        <w:t xml:space="preserve"> jangan membuat tiga dokumen terpisah. Buat satu Spreadsheet berisi alias E, rho, f_co2, lalu tiga kolom nilai untuk baja pejal, baja berusuk, dan aluminium; sel tinggi, massa, dan CO2 menghitung ketiganya berdampingan. Model 3D cukup dibuat untuk alternatif yang menang, sedangkan dua lainnya cukup diwakili angka di Spreadsheet — itulah gunanya model parametrik: alternatif dievaluasi tanpa harus digambar semuanya.</w:t>
       </w:r>
     </w:p>
     <w:p>
@@ -14467,7 +14467,7 @@
           <w:i w:val="0"/>
           <w:sz w:val="17"/>
         </w:rPr>
-        <w:t>sel = [("V0", "500000"), ("r", "=(V0 / (2 * pi))^(1/3)"), ("h", "=2 * r"), ("A", "=6 * pi * r^2")]</w:t>
+        <w:t>sel = [("V0", "500000"), ("r", "=(V0 / (2 * pi))^(1/3)"), ("tinggi", "=2 * r"), ("luas", "=6 * pi * r^2")]</w:t>
       </w:r>
       <w:r>
         <w:br/>
@@ -14515,7 +14515,7 @@
           <w:i w:val="0"/>
           <w:sz w:val="17"/>
         </w:rPr>
-        <w:t>r, h, A = float(sh.get("r")), float(sh.get("h")), float(sh.get("A"))</w:t>
+        <w:t>r, h, A = float(sh.get("r")), float(sh.get("tinggi")), float(sh.get("luas"))</w:t>
       </w:r>
       <w:r>
         <w:br/>
@@ -15204,7 +15204,7 @@
           <w:i w:val="0"/>
           <w:sz w:val="22"/>
         </w:rPr>
-        <w:t>Tulis di lembar pertama Spreadsheet: fungsi tujuan (massa dan jejak CO₂ lengan braket), variabel desain (material dan tinggi h), kendala (δ ≤ 1,5 mm pada F = 4.000 N, L = 700 mm, b = 100 mm), serta batas variabel (h ≤ 90 mm karena ruang pasang). Beri alias F, L, b, d_izin, E, rho, f_co2.</w:t>
+        <w:t>Tulis di lembar pertama Spreadsheet: fungsi tujuan (massa dan jejak CO₂ lengan braket), variabel desain (material dan tinggi h), kendala (δ ≤ 1,5 mm pada F = 4.000 N, L = 700 mm, b = 100 mm), serta batas variabel (h ≤ 90 mm karena ruang pasang). Beri alias gaya, L, b, d_izin, E, rho, f_co2 (bukan F: FreeCAD menolak alias yang sama dengan satuan, mis. F, t, h, A).</w:t>
       </w:r>
     </w:p>
     <w:p>
@@ -15237,7 +15237,7 @@
           <w:i w:val="0"/>
           <w:sz w:val="22"/>
         </w:rPr>
-        <w:t>Body baru: Sketch YZ persegi panjang b × h dengan kedua konstrain terikat ekspresi =Spreadsheet.b dan =Spreadsheet.h, lalu Pad =Spreadsheet.L. Pastikan sketsa fully constrained dan nilai konstrain berwarna biru.</w:t>
+        <w:t>Body baru: Sketch YZ persegi panjang b × h dengan kedua konstrain terikat ekspresi =Spreadsheet.b dan =Spreadsheet.tinggi, lalu Pad =Spreadsheet.L. Pastikan sketsa fully constrained dan nilai konstrain berwarna biru.</w:t>
       </w:r>
     </w:p>
     <w:p>
@@ -16100,7 +16100,7 @@
           <w:i w:val="0"/>
           <w:sz w:val="21"/>
         </w:rPr>
-        <w:t xml:space="preserve"> (1) Spreadsheet berisi alias yang diminta tugas dan sel rumusnya (r/h/A, h_req, d_o, t_req, massa, CO₂); (2) konstrain sketsa terikat ekspresi (nilai biru) dan sketsa fully constrained; (3) Body satu solid dengan pohon fitur sesuai tugas (Sketch → Pad, dua lingkaran sepusat untuk tabung); (4) angka bacaan diambil dari sel Spreadsheet atau Shape sesuai label, dengan jumlah desimal yang diminta; (5) satuan konsisten N–mm–MPa; (6) berkas tersimpan lewat Ctrl+S dengan nama tanpa spasi.</w:t>
+        <w:t xml:space="preserve"> (1) Spreadsheet berisi alias yang diminta tugas dan sel rumusnya (r/tinggi/luas, h_req, d_o, t_req, massa, CO₂); (2) konstrain sketsa terikat ekspresi (nilai biru) dan sketsa fully constrained; (3) Body satu solid dengan pohon fitur sesuai tugas (Sketch → Pad, dua lingkaran sepusat untuk tabung); (4) angka bacaan diambil dari sel Spreadsheet atau Shape sesuai label, dengan jumlah desimal yang diminta; (5) satuan konsisten N–mm–MPa; (6) berkas tersimpan lewat Ctrl+S dengan nama tanpa spasi.</w:t>
       </w:r>
     </w:p>
     <w:p>

</xml_diff>

<commit_message>
fix(cad): alias Spreadsheet bukan nama satuan di Modul 7, 10, 11, 14 (#1027)
Co-authored-by: Claude Sonnet 5.5 <noreply@anthropic.com>
</commit_message>
<xml_diff>
--- a/Pemodelan-Computer-Aided-Design/Modul-Word/Modul-14-Optimasi-Desain-untuk-Efisiensi-dan-Lingkungan.docx
+++ b/Pemodelan-Computer-Aided-Design/Modul-Word/Modul-14-Optimasi-Desain-untuk-Efisiensi-dan-Lingkungan.docx
@@ -4561,7 +4561,7 @@
           <w:i w:val="0"/>
           <w:sz w:val="20"/>
         </w:rPr>
-        <w:t>Gambar 2 — Spreadsheet beralias mengendalikan geometri lewat ekspresi. Sel V0, r, h, dan A diberi alias; radius sketsa dan panjang Pad mengambil nilainya lewat ekspresi =Spreadsheet.r dan =Spreadsheet.h. Mengubah V₀ menghitung ulang seluruh model, dan Shape.Area langsung memberi luas minimum 34.873,42 mm².</w:t>
+        <w:t>Gambar 2 — Spreadsheet beralias mengendalikan geometri lewat ekspresi. Sel V0, r, tinggi, dan luas diberi alias; radius sketsa dan panjang Pad mengambil nilainya lewat ekspresi =Spreadsheet.r dan =Spreadsheet.tinggi. (Jangan memakai h atau A sebagai alias: FreeCAD menolaknya karena sama dengan satuan jam dan ampere.) Mengubah V₀ menghitung ulang seluruh model, dan Shape.Area langsung memberi luas minimum 34.873,42 mm².</w:t>
       </w:r>
     </w:p>
     <w:p>
@@ -6129,7 +6129,7 @@
           <w:i w:val="0"/>
           <w:sz w:val="21"/>
         </w:rPr>
-        <w:t xml:space="preserve"> membaca properti fitur yang bergantung pada sel itu sendiri (mis. Pad.Length yang sudah terikat =Spreadsheet.h). FreeCAD akan menolak dengan pesan </w:t>
+        <w:t xml:space="preserve"> membaca properti fitur yang bergantung pada sel itu sendiri (mis. Pad.Length yang sudah terikat =Spreadsheet.tinggi). FreeCAD akan menolak dengan pesan </w:t>
       </w:r>
       <w:r>
         <w:rPr>
@@ -12123,7 +12123,7 @@
           <w:i w:val="0"/>
           <w:sz w:val="21"/>
         </w:rPr>
-        <w:t xml:space="preserve"> jangan membuat tiga dokumen terpisah. Buat satu Spreadsheet berisi alias E, rho, f_co2, lalu tiga kolom nilai untuk baja pejal, baja berusuk, dan aluminium; sel h, massa, dan CO2 menghitung ketiganya berdampingan. Model 3D cukup dibuat untuk alternatif yang menang, sedangkan dua lainnya cukup diwakili angka di Spreadsheet — itulah gunanya model parametrik: alternatif dievaluasi tanpa harus digambar semuanya.</w:t>
+        <w:t xml:space="preserve"> jangan membuat tiga dokumen terpisah. Buat satu Spreadsheet berisi alias E, rho, f_co2, lalu tiga kolom nilai untuk baja pejal, baja berusuk, dan aluminium; sel tinggi, massa, dan CO2 menghitung ketiganya berdampingan. Model 3D cukup dibuat untuk alternatif yang menang, sedangkan dua lainnya cukup diwakili angka di Spreadsheet — itulah gunanya model parametrik: alternatif dievaluasi tanpa harus digambar semuanya.</w:t>
       </w:r>
     </w:p>
     <w:p>
@@ -14467,7 +14467,7 @@
           <w:i w:val="0"/>
           <w:sz w:val="17"/>
         </w:rPr>
-        <w:t>sel = [("V0", "500000"), ("r", "=(V0 / (2 * pi))^(1/3)"), ("h", "=2 * r"), ("A", "=6 * pi * r^2")]</w:t>
+        <w:t>sel = [("V0", "500000"), ("r", "=(V0 / (2 * pi))^(1/3)"), ("tinggi", "=2 * r"), ("luas", "=6 * pi * r^2")]</w:t>
       </w:r>
       <w:r>
         <w:br/>
@@ -14515,7 +14515,7 @@
           <w:i w:val="0"/>
           <w:sz w:val="17"/>
         </w:rPr>
-        <w:t>r, h, A = float(sh.get("r")), float(sh.get("h")), float(sh.get("A"))</w:t>
+        <w:t>r, h, A = float(sh.get("r")), float(sh.get("tinggi")), float(sh.get("luas"))</w:t>
       </w:r>
       <w:r>
         <w:br/>
@@ -15204,7 +15204,7 @@
           <w:i w:val="0"/>
           <w:sz w:val="22"/>
         </w:rPr>
-        <w:t>Tulis di lembar pertama Spreadsheet: fungsi tujuan (massa dan jejak CO₂ lengan braket), variabel desain (material dan tinggi h), kendala (δ ≤ 1,5 mm pada F = 4.000 N, L = 700 mm, b = 100 mm), serta batas variabel (h ≤ 90 mm karena ruang pasang). Beri alias F, L, b, d_izin, E, rho, f_co2.</w:t>
+        <w:t>Tulis di lembar pertama Spreadsheet: fungsi tujuan (massa dan jejak CO₂ lengan braket), variabel desain (material dan tinggi h), kendala (δ ≤ 1,5 mm pada F = 4.000 N, L = 700 mm, b = 100 mm), serta batas variabel (h ≤ 90 mm karena ruang pasang). Beri alias gaya, L, b, d_izin, E, rho, f_co2 (bukan F: FreeCAD menolak alias yang sama dengan satuan, mis. F, t, h, A).</w:t>
       </w:r>
     </w:p>
     <w:p>
@@ -15237,7 +15237,7 @@
           <w:i w:val="0"/>
           <w:sz w:val="22"/>
         </w:rPr>
-        <w:t>Body baru: Sketch YZ persegi panjang b × h dengan kedua konstrain terikat ekspresi =Spreadsheet.b dan =Spreadsheet.h, lalu Pad =Spreadsheet.L. Pastikan sketsa fully constrained dan nilai konstrain berwarna biru.</w:t>
+        <w:t>Body baru: Sketch YZ persegi panjang b × h dengan kedua konstrain terikat ekspresi =Spreadsheet.b dan =Spreadsheet.tinggi, lalu Pad =Spreadsheet.L. Pastikan sketsa fully constrained dan nilai konstrain berwarna biru.</w:t>
       </w:r>
     </w:p>
     <w:p>
@@ -16100,7 +16100,7 @@
           <w:i w:val="0"/>
           <w:sz w:val="21"/>
         </w:rPr>
-        <w:t xml:space="preserve"> (1) Spreadsheet berisi alias yang diminta tugas dan sel rumusnya (r/h/A, h_req, d_o, t_req, massa, CO₂); (2) konstrain sketsa terikat ekspresi (nilai biru) dan sketsa fully constrained; (3) Body satu solid dengan pohon fitur sesuai tugas (Sketch → Pad, dua lingkaran sepusat untuk tabung); (4) angka bacaan diambil dari sel Spreadsheet atau Shape sesuai label, dengan jumlah desimal yang diminta; (5) satuan konsisten N–mm–MPa; (6) berkas tersimpan lewat Ctrl+S dengan nama tanpa spasi.</w:t>
+        <w:t xml:space="preserve"> (1) Spreadsheet berisi alias yang diminta tugas dan sel rumusnya (r/tinggi/luas, h_req, d_o, t_req, massa, CO₂); (2) konstrain sketsa terikat ekspresi (nilai biru) dan sketsa fully constrained; (3) Body satu solid dengan pohon fitur sesuai tugas (Sketch → Pad, dua lingkaran sepusat untuk tabung); (4) angka bacaan diambil dari sel Spreadsheet atau Shape sesuai label, dengan jumlah desimal yang diminta; (5) satuan konsisten N–mm–MPa; (6) berkas tersimpan lewat Ctrl+S dengan nama tanpa spasi.</w:t>
       </w:r>
     </w:p>
     <w:p>

</xml_diff>

<commit_message>
feat(cad): rekaman Praktik Terbimbing Modul 14 + perbaikan alias F/h
- Video tujuh langkah (2:22): rumusan, model parametrik, tinggi dari kendala,
  sapuan h 30-90, tiga alternatif, matriks keputusan, TechDraw desain B.
- Alias di teks modul disesuaikan dengan yang diterima FreeCAD: langkah 3 dan
  Gambar 7 memakai sel tinggi = (4*gaya*L^3/(E*b*d_izin))^(1/3), massa dan co2
  ditulis eksplisit (rho kg/m3 x 1e-9); tabel Bagian 02 memakai tinggi/luas dan
  gaya (bukan h, A, F); langkah 4 merujuk sel tinggi; Tugas 1 Pad = Spreadsheet.tinggi.
- Langkah 7: contoh wujud desain B (profil I 58, flens 100 x 16, badan 8).

Co-Authored-By: Claude Opus 5.5 <noreply@anthropic.com>
</commit_message>
<xml_diff>
--- a/Pemodelan-Computer-Aided-Design/Modul-Word/Modul-14-Optimasi-Desain-untuk-Efisiensi-dan-Lingkungan.docx
+++ b/Pemodelan-Computer-Aided-Design/Modul-Word/Modul-14-Optimasi-Desain-untuk-Efisiensi-dan-Lingkungan.docx
@@ -4925,7 +4925,7 @@
                 <w:i w:val="0"/>
                 <w:sz w:val="18"/>
               </w:rPr>
-              <w:t>h</w:t>
+              <w:t>tinggi</w:t>
             </w:r>
           </w:p>
         </w:tc>
@@ -5022,7 +5022,7 @@
                 <w:i w:val="0"/>
                 <w:sz w:val="18"/>
               </w:rPr>
-              <w:t>A</w:t>
+              <w:t>luas</w:t>
             </w:r>
           </w:p>
         </w:tc>
@@ -5235,7 +5235,7 @@
                 <w:i w:val="0"/>
                 <w:sz w:val="18"/>
               </w:rPr>
-              <w:t>=(4 * F * L^3 / (E * b * d_izin))^(1/3)</w:t>
+              <w:t>=(4 * gaya * L^3 / (E * b * d_izin))^(1/3)</w:t>
             </w:r>
           </w:p>
         </w:tc>
@@ -15270,7 +15270,7 @@
           <w:i w:val="0"/>
           <w:sz w:val="22"/>
         </w:rPr>
-        <w:t>Tambahkan sel h = (4*F*L^3/(E*b*d_izin))^(1/3). Ctrl+R, lalu catat h, Shape.Volume, massa = rho × Volume, dan CO₂ = f_co2 × massa untuk baja sebagai iterasi 0 (datum).</w:t>
+        <w:t>Tambahkan sel beralias tinggi = =(4*gaya*L^3/(E*b*d_izin))^(1/3) (sel yang dirujuk konstrain langkah 2; aliasnya bukan h), lalu massa = =rho*b*L*tinggi*1e-9 (kg; rho dalam kg/m³) dan co2 = =f_co2*massa. Ctrl+R, cocokkan massa dengan Body.Shape.Volume × rho × 10⁻⁹ di Python console (bukan di sel, agar tidak melingkar), dan catat sebagai iterasi 0 (datum) baja.</w:t>
       </w:r>
     </w:p>
     <w:p>
@@ -15303,7 +15303,7 @@
           <w:i w:val="0"/>
           <w:sz w:val="22"/>
         </w:rPr>
-        <w:t>Jalankan cell kedua Bagian 08 dengan angka kasus ini untuk menyapu h dari 30 sampai 90 mm; tandai h terkecil yang masih memenuhi δ ≤ 1,5 mm dan cocokkan dengan nilai sel h. Selisih di atas 0,5 % berarti ada satuan yang salah.</w:t>
+        <w:t>Jalankan cell kedua Bagian 08 dengan angka kasus ini untuk menyapu h dari 30 sampai 90 mm; tandai h terkecil yang masih memenuhi δ ≤ 1,5 mm dan cocokkan dengan nilai sel tinggi. Selisih di atas 0,5 % berarti ada satuan yang salah.</w:t>
       </w:r>
     </w:p>
     <w:p>
@@ -15402,7 +15402,7 @@
           <w:i w:val="0"/>
           <w:sz w:val="22"/>
         </w:rPr>
-        <w:t>TechDraw: Page + tiga pandangan desain pemenang, dimensi pada h dan b, catatan berisi massa, jejak CO₂, dan faktor emisi yang dipakai. Ctrl+S → Latihan14_NIM.FCStd.</w:t>
+        <w:t>TechDraw: Page + tiga pandangan desain pemenang (untuk B, misalnya profil I tinggi 58, flens 100 × 16, badan 8 mm: I ≥ pejal, massa ±61 %), dimensi pada h dan b, catatan berisi massa, jejak CO₂, dan faktor emisi yang dipakai. Ctrl+S → Latihan14_NIM.FCStd.</w:t>
       </w:r>
     </w:p>
     <w:p>

</xml_diff>

<commit_message>
feat(cad): rekaman Praktik Terbimbing Modul 14 + perbaikan alias F/h (#1034)
- Video tujuh langkah (2:22): rumusan, model parametrik, tinggi dari kendala,
  sapuan h 30-90, tiga alternatif, matriks keputusan, TechDraw desain B.
- Alias di teks modul disesuaikan dengan yang diterima FreeCAD: langkah 3 dan
  Gambar 7 memakai sel tinggi = (4*gaya*L^3/(E*b*d_izin))^(1/3), massa dan co2
  ditulis eksplisit (rho kg/m3 x 1e-9); tabel Bagian 02 memakai tinggi/luas dan
  gaya (bukan h, A, F); langkah 4 merujuk sel tinggi; Tugas 1 Pad = Spreadsheet.tinggi.
- Langkah 7: contoh wujud desain B (profil I 58, flens 100 x 16, badan 8).

Co-authored-by: Claude Opus 5.5 <noreply@anthropic.com>
</commit_message>
<xml_diff>
--- a/Pemodelan-Computer-Aided-Design/Modul-Word/Modul-14-Optimasi-Desain-untuk-Efisiensi-dan-Lingkungan.docx
+++ b/Pemodelan-Computer-Aided-Design/Modul-Word/Modul-14-Optimasi-Desain-untuk-Efisiensi-dan-Lingkungan.docx
@@ -4925,7 +4925,7 @@
                 <w:i w:val="0"/>
                 <w:sz w:val="18"/>
               </w:rPr>
-              <w:t>h</w:t>
+              <w:t>tinggi</w:t>
             </w:r>
           </w:p>
         </w:tc>
@@ -5022,7 +5022,7 @@
                 <w:i w:val="0"/>
                 <w:sz w:val="18"/>
               </w:rPr>
-              <w:t>A</w:t>
+              <w:t>luas</w:t>
             </w:r>
           </w:p>
         </w:tc>
@@ -5235,7 +5235,7 @@
                 <w:i w:val="0"/>
                 <w:sz w:val="18"/>
               </w:rPr>
-              <w:t>=(4 * F * L^3 / (E * b * d_izin))^(1/3)</w:t>
+              <w:t>=(4 * gaya * L^3 / (E * b * d_izin))^(1/3)</w:t>
             </w:r>
           </w:p>
         </w:tc>
@@ -15270,7 +15270,7 @@
           <w:i w:val="0"/>
           <w:sz w:val="22"/>
         </w:rPr>
-        <w:t>Tambahkan sel h = (4*F*L^3/(E*b*d_izin))^(1/3). Ctrl+R, lalu catat h, Shape.Volume, massa = rho × Volume, dan CO₂ = f_co2 × massa untuk baja sebagai iterasi 0 (datum).</w:t>
+        <w:t>Tambahkan sel beralias tinggi = =(4*gaya*L^3/(E*b*d_izin))^(1/3) (sel yang dirujuk konstrain langkah 2; aliasnya bukan h), lalu massa = =rho*b*L*tinggi*1e-9 (kg; rho dalam kg/m³) dan co2 = =f_co2*massa. Ctrl+R, cocokkan massa dengan Body.Shape.Volume × rho × 10⁻⁹ di Python console (bukan di sel, agar tidak melingkar), dan catat sebagai iterasi 0 (datum) baja.</w:t>
       </w:r>
     </w:p>
     <w:p>
@@ -15303,7 +15303,7 @@
           <w:i w:val="0"/>
           <w:sz w:val="22"/>
         </w:rPr>
-        <w:t>Jalankan cell kedua Bagian 08 dengan angka kasus ini untuk menyapu h dari 30 sampai 90 mm; tandai h terkecil yang masih memenuhi δ ≤ 1,5 mm dan cocokkan dengan nilai sel h. Selisih di atas 0,5 % berarti ada satuan yang salah.</w:t>
+        <w:t>Jalankan cell kedua Bagian 08 dengan angka kasus ini untuk menyapu h dari 30 sampai 90 mm; tandai h terkecil yang masih memenuhi δ ≤ 1,5 mm dan cocokkan dengan nilai sel tinggi. Selisih di atas 0,5 % berarti ada satuan yang salah.</w:t>
       </w:r>
     </w:p>
     <w:p>
@@ -15402,7 +15402,7 @@
           <w:i w:val="0"/>
           <w:sz w:val="22"/>
         </w:rPr>
-        <w:t>TechDraw: Page + tiga pandangan desain pemenang, dimensi pada h dan b, catatan berisi massa, jejak CO₂, dan faktor emisi yang dipakai. Ctrl+S → Latihan14_NIM.FCStd.</w:t>
+        <w:t>TechDraw: Page + tiga pandangan desain pemenang (untuk B, misalnya profil I tinggi 58, flens 100 × 16, badan 8 mm: I ≥ pejal, massa ±61 %), dimensi pada h dan b, catatan berisi massa, jejak CO₂, dan faktor emisi yang dipakai. Ctrl+S → Latihan14_NIM.FCStd.</w:t>
       </w:r>
     </w:p>
     <w:p>

</xml_diff>

<commit_message>
feat(cad): video Modul 14 versi klik GUI + teks praktik sesuai rekaman
- Video praktik terbimbing Modul 14 direkam ulang dengan klik GUI asli
  (23:11, 9 klip, delapan langkah): rumusan dan alias Spreadsheet, model
  parametrik terikat ekspresi, tinggi dari kendala, sapuan, alternatif,
  matriks keputusan, desain pemenang profil I, dan gambar kerja TechDraw
  proyeksi sudut ketiga 1 : 4 + PDF.
- Teks Bagian 09 menjadi delapan langkah sesuai rekaman; langkah 6 memuat
  dasar tiap tanda +1/0/−1 terhadap datum baja pejal; langkah 8 memakai
  template A4_Landscape_ISO5457_sudut_ketiga.svg; tabel gejala ditambah
  jebakan rekaman (Merge Cells, daftar Constraints, Pocket Symmetric,
  Third angle).
- Gambar 7 diberi pita penampang desain B (profil I 100 × 58, flens 16,
  badan 8) beserta ringkasan massa, jejak CO₂, dan lendutan.
- Poster, bab video, Modul-Word/PDF, dan PDF gabungan CAD diperbarui.

Co-Authored-By: Claude Opus 5.5 <noreply@anthropic.com>
</commit_message>
<xml_diff>
--- a/Pemodelan-Computer-Aided-Design/Modul-Word/Modul-14-Optimasi-Desain-untuk-Efisiensi-dan-Lingkungan.docx
+++ b/Pemodelan-Computer-Aided-Design/Modul-Word/Modul-14-Optimasi-Desain-untuk-Efisiensi-dan-Lingkungan.docx
@@ -15115,7 +15115,7 @@
           <w:i w:val="0"/>
           <w:sz w:val="22"/>
         </w:rPr>
-        <w:t>Tujuh langkah berikut menjalankan satu putaran optimasi utuh pada lengan braket rak: merumuskan masalah, membangun model parametrik, menghitung tinggi dari kendala, menyapu parameter, membandingkan tiga alternatif, menyusun matriks keputusan, dan mendokumentasikannya di TechDraw.</w:t>
+        <w:t>Delapan langkah berikut menjalankan satu putaran optimasi utuh pada lengan braket rak: merumuskan masalah, membangun model parametrik, menghitung tinggi dari kendala, menyapu parameter, membandingkan tiga alternatif, menyusun matriks keputusan, memodelkan desain pemenang (profil I), lalu mendokumentasikannya dalam gambar kerja sudut ketiga.</w:t>
       </w:r>
     </w:p>
     <w:p>
@@ -15127,7 +15127,7 @@
       <w:r>
         <w:drawing>
           <wp:inline xmlns:a="http://schemas.openxmlformats.org/drawingml/2006/main" xmlns:pic="http://schemas.openxmlformats.org/drawingml/2006/picture">
-            <wp:extent cx="5400000" cy="2955850"/>
+            <wp:extent cx="5400000" cy="4067867"/>
             <wp:docPr id="1858245154" name="Picture 1858245154"/>
             <wp:cNvGraphicFramePr>
               <a:graphicFrameLocks noChangeAspect="1"/>
@@ -15148,7 +15148,7 @@
                   <pic:spPr>
                     <a:xfrm>
                       <a:off x="0" y="0"/>
-                      <a:ext cx="5400000" cy="2955850"/>
+                      <a:ext cx="5400000" cy="4067867"/>
                     </a:xfrm>
                     <a:prstGeom prst="rect"/>
                   </pic:spPr>
@@ -15171,7 +15171,7 @@
           <w:i w:val="0"/>
           <w:sz w:val="20"/>
         </w:rPr>
-        <w:t>Gambar 7 — Gambar kerja lengan braket kantilever dengan variabel desain h. Ukuran dalam mm, gaya dalam N. Lengan pejal b × h × L dijepit pada bidang Sketch YZ dan memikul F = 4.000 N di ujung bebas dengan kendala lendutan ujung δ ≤ 1,5 (langkah 1); penampangnya adalah sketsa b × h pada langkah 2. Tinggi h adalah variabel desain: dihitung dari kendala pada langkah 3, disapu 30–90 pada langkah 4, dan dibatasi ruang pasang h ≤ 90. Catatan memuat alias, rumus, dan angka alternatif yang diketik pada langkah 1–6.</w:t>
+        <w:t>Gambar 7 — Gambar kerja lengan braket kantilever dengan variabel desain h. Ukuran dalam mm, gaya dalam N. Lengan pejal b × h × L dijepit pada bidang Sketch YZ dan memikul F = 4.000 N di ujung bebas dengan kendala lendutan ujung δ ≤ 1,5 (langkah 1); penampangnya adalah sketsa b × h pada langkah 2. Tinggi h adalah variabel desain: dihitung dari kendala pada langkah 3, disapu 30–90 pada langkah 4, dan dibatasi ruang pasang h ≤ 90. Catatan memuat alias, rumus, dan angka alternatif yang diketik pada langkah 1–6. Pita bawah: penampang desain B (profil I 100 × 58, flens 16, badan 8) yang dimodelkan pada langkah 7 dan digambar dalam proyeksi sudut ketiga pada langkah 8.</w:t>
       </w:r>
     </w:p>
     <w:p>
@@ -15204,7 +15204,7 @@
           <w:i w:val="0"/>
           <w:sz w:val="22"/>
         </w:rPr>
-        <w:t>Tulis di lembar pertama Spreadsheet: fungsi tujuan (massa dan jejak CO₂ lengan braket), variabel desain (material dan tinggi h), kendala (δ ≤ 1,5 mm pada F = 4.000 N, L = 700 mm, b = 100 mm), serta batas variabel (h ≤ 90 mm karena ruang pasang). Beri alias gaya, L, b, d_izin, E, rho, f_co2 (bukan F: FreeCAD menolak alias yang sama dengan satuan, mis. F, t, h, A).</w:t>
+        <w:t>File → New Document; workbench Spreadsheet → New Spreadsheet, klik ganda untuk membuka. Baris 1–4 untuk rumusan: klik A1, Shift+klik H1 → Spreadsheet → Merge Cells (teks sel tidak meluap ke sel sebelah), lalu tulis tujuan (minimumkan massa dan jejak CO₂ lengan braket); ulangi untuk variabel desain (material dan tinggi penampang h, b tetap), kendala (lendutan ujung ≤ 1,5 mm pada F 4.000 N, L 700, b 100), dan batas variabel (tinggi ≤ 90 mm karena ruang pasang). A6–A13: gaya, L, b, d_izin, E, rho, f_co2, tinggi; B6–B13: 4000, 700, 100, 1.5, 210000, 7850 (kg/m³), 2, 60 (nilai awal tinggi; sel memakai titik desimal). Pilih tiap sel B → kotak Alias: nama di kolom A (bukan F, t, h, atau A: FreeCAD menolak alias yang sama dengan satuan).</w:t>
       </w:r>
     </w:p>
     <w:p>
@@ -15237,7 +15237,25 @@
           <w:i w:val="0"/>
           <w:sz w:val="22"/>
         </w:rPr>
-        <w:t>Body baru: Sketch YZ persegi panjang b × h dengan kedua konstrain terikat ekspresi =Spreadsheet.b dan =Spreadsheet.tinggi, lalu Pad =Spreadsheet.L. Pastikan sketsa fully constrained dan nilai konstrain berwarna biru.</w:t>
+        <w:t xml:space="preserve">Tab 3D, workbench Part Design → New Body; Sketch → New Sketch → YZ-plane; Rectangle dengan </w:t>
+      </w:r>
+      <w:r>
+        <w:rPr>
+          <w:rFonts w:ascii="Arial" w:hAnsi="Arial" w:eastAsia="Arial" w:cs="Arial"/>
+          <w:b w:val="0"/>
+          <w:i/>
+          <w:sz w:val="22"/>
+        </w:rPr>
+        <w:t>on-view parameters</w:t>
+      </w:r>
+      <w:r>
+        <w:rPr>
+          <w:rFonts w:ascii="Arial" w:hAnsi="Arial" w:eastAsia="Arial" w:cs="Arial"/>
+          <w:b w:val="0"/>
+          <w:i w:val="0"/>
+          <w:sz w:val="22"/>
+        </w:rPr>
+        <w:t>: sudut −50, 0 lalu 100 × 60. Di daftar Constraints, klik ganda konstrain (100 mm) → ketik = lalu Spreadsheet.b; konstrain (60 mm) → Spreadsheet.tinggi. Sketsa tetap fully constrained dan kedua nilainya terikat ekspresi. Close → Pad, kotak Length: =Spreadsheet.L → OK: volume 4.200.000 mm³.</w:t>
       </w:r>
     </w:p>
     <w:p>
@@ -15270,7 +15288,7 @@
           <w:i w:val="0"/>
           <w:sz w:val="22"/>
         </w:rPr>
-        <w:t>Tambahkan sel beralias tinggi = =(4*gaya*L^3/(E*b*d_izin))^(1/3) (sel yang dirujuk konstrain langkah 2; aliasnya bukan h), lalu massa = =rho*b*L*tinggi*1e-9 (kg; rho dalam kg/m³) dan co2 = =f_co2*massa. Ctrl+R, cocokkan massa dengan Body.Shape.Volume × rho × 10⁻⁹ di Python console (bukan di sel, agar tidak melingkar), dan catat sebagai iterasi 0 (datum) baja.</w:t>
+        <w:t>Tab Spreadsheet: B13 (alias tinggi) diganti =(4*gaya*L^3/(E*b*d_izin))^(1/3); A14 massa, B14 =rho*b*L*tinggi*1e-9 (kg); A15 co2, B15 =f_co2*massa; beri alias massa dan co2 → Refresh (Ctrl+R): tinggi 55,851 mm, massa 30,69 kg, co2 61,38 kg. Pad ikut menipis karena konstrainnya membaca sel tinggi. Tab 3D, Python console: round(App.ActiveDocument.Body.Shape.Volume) = 3.909.602 mm³ dan round(App.ActiveDocument.Body.Shape.Volume * 7850e-9, 2) = 30,69 kg, sama dengan sel massa (dibaca di konsol, bukan di sel, agar tidak melingkar). Catat sebagai iterasi 0 (datum) baja.</w:t>
       </w:r>
     </w:p>
     <w:p>
@@ -15303,7 +15321,7 @@
           <w:i w:val="0"/>
           <w:sz w:val="22"/>
         </w:rPr>
-        <w:t>Jalankan cell kedua Bagian 08 dengan angka kasus ini untuk menyapu h dari 30 sampai 90 mm; tandai h terkecil yang masih memenuhi δ ≤ 1,5 mm dan cocokkan dengan nilai sel tinggi. Selisih di atas 0,5 % berarti ada satuan yang salah.</w:t>
+        <w:t>Konsol: [(h, round(4*4000*700**3/(210000*100*h**3), 3)) for h in range(30, 91) if 4*4000*700**3/(210000*100*h**3) &lt;= 1.5][0] → (56, 1.488): h bulat terkecil dalam rentang 30–90 mm yang memenuhi δ ≤ 1,5 mm (rumus sapuan cell kedua Bagian 08 dengan angka kasus ini). Cocokkan dengan sel: t = App.ActiveDocument.Spreadsheet.tinggi, lalu round(100 * 56 / t - 100, 2) = 0,27 %, di bawah 0,5 %. Selisih yang lebih besar berarti ada satuan yang salah.</w:t>
       </w:r>
     </w:p>
     <w:p>
@@ -15336,7 +15354,7 @@
           <w:i w:val="0"/>
           <w:sz w:val="22"/>
         </w:rPr>
-        <w:t>Kolom kedua Spreadsheet: aluminium (E 70.000, ρ 2.700, f 12,0). Kolom ketiga: baja berusuk dengan massa 60 % pelat pejal pada I setara. Hitung h, massa, dan CO₂ ketiganya berdampingan.</w:t>
+        <w:t>Tab Spreadsheet, baris 17–21: h_al =(4*gaya*L^3/(70000*b*d_izin))^(1/3) = 80,55 mm; m_al =2700*b*L*B17*1e-9 = 15,22 kg; co2_al =12*B18 = 182,69 kg; m_rusuk =0.6*massa = 18,41 kg (baja berusuk: 60 % pelat pejal pada I setara); co2_rusuk =f_co2*B20 = 36,83 kg. Ketiga alternatif kini berdampingan dengan datum baja pejal.</w:t>
       </w:r>
     </w:p>
     <w:p>
@@ -15369,7 +15387,7 @@
           <w:i w:val="0"/>
           <w:sz w:val="22"/>
         </w:rPr>
-        <w:t>Lembar kedua: lima kriteria dengan bobot 0,25 / 0,25 / 0,20 / 0,15 / 0,15, nilai −1, 0, +1 terhadap datum baja pejal, lalu skor berbobot Persamaan (6). Tulis satu kalimat alasan untuk setiap tanda − yang diberikan.</w:t>
+        <w:t>Spreadsheet baru, F2 → Matriks, klik ganda. A1–D1: kriteria, bobot, B_rusuk, C_al; baris 2–6: massa 0,25 (1, 1), co2 0,25 (1, −1), biaya 0,20 (−1, −1), buat 0,15 (−1, 0), tinggi 0,15 (0, −1) terhadap datum baja pejal (bobot diketik dengan titik desimal). Dasar tanda (+1 lebih baik, 0 setara, −1 lebih buruk daripada datum A; bobot dari Bagian 05): massa — B 18,41 kg dan C 15,22 kg lebih ringan daripada 30,69 kg (+1, +1); CO₂ — B 36,83 kg di bawah 61,38 kg (+1), C 182,69 kg di atasnya (−1); biaya bahan + proses — rusuk B butuh las/pemesinan, aluminium C lebih mahal per kg (−1, −1); kemudahan pembuatan — B menambah satu operasi las (−1), C tetap satu pelat pejal seperti A (0); tinggi terpasang — B setinggi datum 55,85 mm (0), C 80,55 mm mendekati batas ruang pasang 90 mm (−1). A7 skor; C7 =B2*C2+B3*C3+B4*C4+B5*C5+B6*C6 = 0,15 dan D7 dengan kolom D = −0,35 (Persamaan 6). Baris 9: Merge Cells A9:H9, lalu tulis alasannya: “Pemenang: B baja berusuk (+0,15); C kalah pada CO2, biaya, dan tinggi terpasang”.</w:t>
       </w:r>
     </w:p>
     <w:p>
@@ -15393,16 +15411,139 @@
           <w:i w:val="0"/>
           <w:sz w:val="22"/>
         </w:rPr>
-        <w:t xml:space="preserve">Dokumentasikan dan simpan: </w:t>
-      </w:r>
-      <w:r>
-        <w:rPr>
-          <w:rFonts w:ascii="Arial" w:hAnsi="Arial" w:eastAsia="Arial" w:cs="Arial"/>
-          <w:b w:val="0"/>
-          <w:i w:val="0"/>
-          <w:sz w:val="22"/>
-        </w:rPr>
-        <w:t>TechDraw: Page + tiga pandangan desain pemenang (untuk B, misalnya profil I tinggi 58, flens 100 × 16, badan 8 mm: I ≥ pejal, massa ±61 %), dimensi pada h dan b, catatan berisi massa, jejak CO₂, dan faktor emisi yang dipakai. Ctrl+S → Latihan14_NIM.FCStd.</w:t>
+        <w:t xml:space="preserve">Modelkan desain pemenang: </w:t>
+      </w:r>
+      <w:r>
+        <w:rPr>
+          <w:rFonts w:ascii="Arial" w:hAnsi="Arial" w:eastAsia="Arial" w:cs="Arial"/>
+          <w:b w:val="0"/>
+          <w:i w:val="0"/>
+          <w:sz w:val="22"/>
+        </w:rPr>
+        <w:t xml:space="preserve">Tab 3D, sembunyikan Body (Space); Part Design → New Body, F2 → LenganB. Sketch YZ: Rectangle −50, 0 ukuran 100 × 58 → Pad 700. Sketch YZ kedua: dua Rectangle mulai 4, 16 dan −50, 16, masing-masing 46 × 26 (flens 16, badan 8) → Pocket, Type </w:t>
+      </w:r>
+      <w:r>
+        <w:rPr>
+          <w:rFonts w:ascii="Arial" w:hAnsi="Arial" w:eastAsia="Arial" w:cs="Arial"/>
+          <w:b w:val="0"/>
+          <w:i/>
+          <w:sz w:val="22"/>
+        </w:rPr>
+        <w:t>Through all</w:t>
+      </w:r>
+      <w:r>
+        <w:rPr>
+          <w:rFonts w:ascii="Arial" w:hAnsi="Arial" w:eastAsia="Arial" w:cs="Arial"/>
+          <w:b w:val="0"/>
+          <w:i w:val="0"/>
+          <w:sz w:val="22"/>
+        </w:rPr>
+        <w:t xml:space="preserve">, mode </w:t>
+      </w:r>
+      <w:r>
+        <w:rPr>
+          <w:rFonts w:ascii="Arial" w:hAnsi="Arial" w:eastAsia="Arial" w:cs="Arial"/>
+          <w:b w:val="0"/>
+          <w:i/>
+          <w:sz w:val="22"/>
+        </w:rPr>
+        <w:t>Symmetric</w:t>
+      </w:r>
+      <w:r>
+        <w:rPr>
+          <w:rFonts w:ascii="Arial" w:hAnsi="Arial" w:eastAsia="Arial" w:cs="Arial"/>
+          <w:b w:val="0"/>
+          <w:i w:val="0"/>
+          <w:sz w:val="22"/>
+        </w:rPr>
+        <w:t xml:space="preserve"> (sketsa berada di pangkal Pad). Konsol: v = App.ActiveDocument.getObjectsByLabel('LenganB')[0].Shape.Volume; round(v) = 2.385.600 mm³; massa 18,73 kg dan jejak 37,45 kg CO₂, 61 % pelat pejal; lendutan round(4 * 4000 * 700**3 / (210000 * (100 * 58**3 - 92 * 26**3)), 2) = 1,46 mm ≤ 1,5 mm.</w:t>
+      </w:r>
+    </w:p>
+    <w:p>
+      <w:pPr>
+        <w:spacing w:line="360" w:lineRule="auto" w:after="60"/>
+        <w:ind w:left="425" w:hanging="227"/>
+      </w:pPr>
+      <w:r>
+        <w:rPr>
+          <w:rFonts w:ascii="Arial" w:hAnsi="Arial" w:eastAsia="Arial" w:cs="Arial"/>
+          <w:b w:val="0"/>
+          <w:i w:val="0"/>
+          <w:sz w:val="22"/>
+        </w:rPr>
+        <w:t xml:space="preserve">•  </w:t>
+      </w:r>
+      <w:r>
+        <w:rPr>
+          <w:rFonts w:ascii="Arial" w:hAnsi="Arial" w:eastAsia="Arial" w:cs="Arial"/>
+          <w:b/>
+          <w:i w:val="0"/>
+          <w:sz w:val="22"/>
+        </w:rPr>
+        <w:t xml:space="preserve">Gambar kerja sudut ketiga dan simpan: </w:t>
+      </w:r>
+      <w:r>
+        <w:rPr>
+          <w:rFonts w:ascii="Arial" w:hAnsi="Arial" w:eastAsia="Arial" w:cs="Arial"/>
+          <w:b w:val="0"/>
+          <w:i w:val="0"/>
+          <w:sz w:val="22"/>
+        </w:rPr>
+        <w:t xml:space="preserve">Workbench TechDraw → Page → New Page From Template → A4_Landscape_ISO5457_sudut_ketiga.svg (template ISO A4 dengan simbol sudut ketiga; unduh dulu). Pilih LenganB → TechDraw Views → </w:t>
+      </w:r>
+      <w:r>
+        <w:rPr>
+          <w:rFonts w:ascii="Arial" w:hAnsi="Arial" w:eastAsia="Arial" w:cs="Arial"/>
+          <w:b/>
+          <w:i w:val="0"/>
+          <w:sz w:val="22"/>
+        </w:rPr>
+        <w:t>Projection Group</w:t>
+      </w:r>
+      <w:r>
+        <w:rPr>
+          <w:rFonts w:ascii="Arial" w:hAnsi="Arial" w:eastAsia="Arial" w:cs="Arial"/>
+          <w:b w:val="0"/>
+          <w:i w:val="0"/>
+          <w:sz w:val="22"/>
+        </w:rPr>
+        <w:t xml:space="preserve">: tombol Front (arah depan dokumen), Projection </w:t>
+      </w:r>
+      <w:r>
+        <w:rPr>
+          <w:rFonts w:ascii="Arial" w:hAnsi="Arial" w:eastAsia="Arial" w:cs="Arial"/>
+          <w:b w:val="0"/>
+          <w:i/>
+          <w:sz w:val="22"/>
+        </w:rPr>
+        <w:t>Third angle</w:t>
+      </w:r>
+      <w:r>
+        <w:rPr>
+          <w:rFonts w:ascii="Arial" w:hAnsi="Arial" w:eastAsia="Arial" w:cs="Arial"/>
+          <w:b w:val="0"/>
+          <w:i w:val="0"/>
+          <w:sz w:val="22"/>
+        </w:rPr>
+        <w:t xml:space="preserve">, centang Top dan Right, Scale Custom 1 : 4, X/Y spacing 25 → OK; ProjGroup Data X 122, Y 122: Atas di atas Depan, Kanan di kanan Depan. Dimensi, semua 12 mm dari benda: tepi bawah Depan → Length Dimension 700 (seret ke bawah); tepi atas Kanan → Length Dimension 100 (ke atas); dua titik sudut kanan pandangan Kanan (Ctrl+klik) → Vertical Length Dimension 58 (ke kanan). Kepala gambar: Title “Lengan Braket Desain B”, Created by (nama dan NIM Anda), Approved by (nama dosen pengampu), Document type “Gambar Kerja”, Part Material “Baja S275JR”, Scale “1 : 4”. Annotations → </w:t>
+      </w:r>
+      <w:r>
+        <w:rPr>
+          <w:rFonts w:ascii="Arial" w:hAnsi="Arial" w:eastAsia="Arial" w:cs="Arial"/>
+          <w:b/>
+          <w:i w:val="0"/>
+          <w:sz w:val="22"/>
+        </w:rPr>
+        <w:t>Text Annotation</w:t>
+      </w:r>
+      <w:r>
+        <w:rPr>
+          <w:rFonts w:ascii="Arial" w:hAnsi="Arial" w:eastAsia="Arial" w:cs="Arial"/>
+          <w:b w:val="0"/>
+          <w:i w:val="0"/>
+          <w:sz w:val="22"/>
+        </w:rPr>
+        <w:t>: Data Text Size 3,5, X 101,5, Y 80; klik ganda teksnya → tulis CATATAN: profil dan lendutan, massa, serta jejak CO₂ dengan faktor emisi baja → OK. Ctrl+S → Latihan14_NIM.FCStd; File → Export PDF → Latihan14_NIM.pdf.</w:t>
       </w:r>
     </w:p>
     <w:p>
@@ -15491,6 +15632,242 @@
                 <w:sz w:val="18"/>
               </w:rPr>
               <w:t>Perbaikan</w:t>
+            </w:r>
+          </w:p>
+        </w:tc>
+      </w:tr>
+      <w:tr>
+        <w:tc>
+          <w:tcPr>
+            <w:tcW w:type="dxa" w:w="2929"/>
+          </w:tcPr>
+          <w:p>
+            <w:pPr>
+              <w:spacing w:after="0"/>
+            </w:pPr>
+            <w:r>
+              <w:rPr>
+                <w:rFonts w:ascii="Arial" w:hAnsi="Arial" w:eastAsia="Arial" w:cs="Arial"/>
+                <w:b w:val="0"/>
+                <w:i w:val="0"/>
+                <w:sz w:val="18"/>
+              </w:rPr>
+              <w:t>Teks rumusan di A1 terpotong</w:t>
+            </w:r>
+          </w:p>
+        </w:tc>
+        <w:tc>
+          <w:tcPr>
+            <w:tcW w:type="dxa" w:w="2929"/>
+          </w:tcPr>
+          <w:p>
+            <w:pPr>
+              <w:spacing w:after="0"/>
+            </w:pPr>
+            <w:r>
+              <w:rPr>
+                <w:rFonts w:ascii="Arial" w:hAnsi="Arial" w:eastAsia="Arial" w:cs="Arial"/>
+                <w:b w:val="0"/>
+                <w:i w:val="0"/>
+                <w:sz w:val="18"/>
+              </w:rPr>
+              <w:t>Teks sel Spreadsheet tidak meluap ke sel sebelah</w:t>
+            </w:r>
+          </w:p>
+        </w:tc>
+        <w:tc>
+          <w:tcPr>
+            <w:tcW w:type="dxa" w:w="2929"/>
+          </w:tcPr>
+          <w:p>
+            <w:pPr>
+              <w:spacing w:after="0"/>
+            </w:pPr>
+            <w:r>
+              <w:rPr>
+                <w:rFonts w:ascii="Arial" w:hAnsi="Arial" w:eastAsia="Arial" w:cs="Arial"/>
+                <w:b w:val="0"/>
+                <w:i w:val="0"/>
+                <w:sz w:val="18"/>
+              </w:rPr>
+              <w:t>Pilih A1:H1 → Spreadsheet → Merge Cells sebelum mengetik</w:t>
+            </w:r>
+          </w:p>
+        </w:tc>
+      </w:tr>
+      <w:tr>
+        <w:tc>
+          <w:tcPr>
+            <w:tcW w:type="dxa" w:w="2929"/>
+          </w:tcPr>
+          <w:p>
+            <w:pPr>
+              <w:spacing w:after="0"/>
+            </w:pPr>
+            <w:r>
+              <w:rPr>
+                <w:rFonts w:ascii="Arial" w:hAnsi="Arial" w:eastAsia="Arial" w:cs="Arial"/>
+                <w:b w:val="0"/>
+                <w:i w:val="0"/>
+                <w:sz w:val="18"/>
+              </w:rPr>
+              <w:t>Klik ganda konstrain tidak membuka kotak nilai</w:t>
+            </w:r>
+          </w:p>
+        </w:tc>
+        <w:tc>
+          <w:tcPr>
+            <w:tcW w:type="dxa" w:w="2929"/>
+          </w:tcPr>
+          <w:p>
+            <w:pPr>
+              <w:spacing w:after="0"/>
+            </w:pPr>
+            <w:r>
+              <w:rPr>
+                <w:rFonts w:ascii="Arial" w:hAnsi="Arial" w:eastAsia="Arial" w:cs="Arial"/>
+                <w:b w:val="0"/>
+                <w:i w:val="0"/>
+                <w:sz w:val="18"/>
+              </w:rPr>
+              <w:t>Baris konstrain di daftar Constraints belum terlihat</w:t>
+            </w:r>
+          </w:p>
+        </w:tc>
+        <w:tc>
+          <w:tcPr>
+            <w:tcW w:type="dxa" w:w="2929"/>
+          </w:tcPr>
+          <w:p>
+            <w:pPr>
+              <w:spacing w:after="0"/>
+            </w:pPr>
+            <w:r>
+              <w:rPr>
+                <w:rFonts w:ascii="Arial" w:hAnsi="Arial" w:eastAsia="Arial" w:cs="Arial"/>
+                <w:b w:val="0"/>
+                <w:i w:val="0"/>
+                <w:sz w:val="18"/>
+              </w:rPr>
+              <w:t>Gulir daftar Constraints sampai baris (100 mm) atau (60 mm) tampak, lalu klik ganda</w:t>
+            </w:r>
+          </w:p>
+        </w:tc>
+      </w:tr>
+      <w:tr>
+        <w:tc>
+          <w:tcPr>
+            <w:tcW w:type="dxa" w:w="2929"/>
+          </w:tcPr>
+          <w:p>
+            <w:pPr>
+              <w:spacing w:after="0"/>
+            </w:pPr>
+            <w:r>
+              <w:rPr>
+                <w:rFonts w:ascii="Arial" w:hAnsi="Arial" w:eastAsia="Arial" w:cs="Arial"/>
+                <w:b w:val="0"/>
+                <w:i w:val="0"/>
+                <w:sz w:val="18"/>
+              </w:rPr>
+              <w:t>Pocket profil I tidak memotong apa pun</w:t>
+            </w:r>
+          </w:p>
+        </w:tc>
+        <w:tc>
+          <w:tcPr>
+            <w:tcW w:type="dxa" w:w="2929"/>
+          </w:tcPr>
+          <w:p>
+            <w:pPr>
+              <w:spacing w:after="0"/>
+            </w:pPr>
+            <w:r>
+              <w:rPr>
+                <w:rFonts w:ascii="Arial" w:hAnsi="Arial" w:eastAsia="Arial" w:cs="Arial"/>
+                <w:b w:val="0"/>
+                <w:i w:val="0"/>
+                <w:sz w:val="18"/>
+              </w:rPr>
+              <w:t>Sketsa di pangkal Pad, sedangkan Pocket memotong ke arah luar</w:t>
+            </w:r>
+          </w:p>
+        </w:tc>
+        <w:tc>
+          <w:tcPr>
+            <w:tcW w:type="dxa" w:w="2929"/>
+          </w:tcPr>
+          <w:p>
+            <w:pPr>
+              <w:spacing w:after="0"/>
+            </w:pPr>
+            <w:r>
+              <w:rPr>
+                <w:rFonts w:ascii="Arial" w:hAnsi="Arial" w:eastAsia="Arial" w:cs="Arial"/>
+                <w:b w:val="0"/>
+                <w:i w:val="0"/>
+                <w:sz w:val="18"/>
+              </w:rPr>
+              <w:t>Type Through all dengan mode Symmetric (atau Reversed)</w:t>
+            </w:r>
+          </w:p>
+        </w:tc>
+      </w:tr>
+      <w:tr>
+        <w:tc>
+          <w:tcPr>
+            <w:tcW w:type="dxa" w:w="2929"/>
+          </w:tcPr>
+          <w:p>
+            <w:pPr>
+              <w:spacing w:after="0"/>
+            </w:pPr>
+            <w:r>
+              <w:rPr>
+                <w:rFonts w:ascii="Arial" w:hAnsi="Arial" w:eastAsia="Arial" w:cs="Arial"/>
+                <w:b w:val="0"/>
+                <w:i w:val="0"/>
+                <w:sz w:val="18"/>
+              </w:rPr>
+              <w:t>Pandangan Atas berada di bawah Depan</w:t>
+            </w:r>
+          </w:p>
+        </w:tc>
+        <w:tc>
+          <w:tcPr>
+            <w:tcW w:type="dxa" w:w="2929"/>
+          </w:tcPr>
+          <w:p>
+            <w:pPr>
+              <w:spacing w:after="0"/>
+            </w:pPr>
+            <w:r>
+              <w:rPr>
+                <w:rFonts w:ascii="Arial" w:hAnsi="Arial" w:eastAsia="Arial" w:cs="Arial"/>
+                <w:b w:val="0"/>
+                <w:i w:val="0"/>
+                <w:sz w:val="18"/>
+              </w:rPr>
+              <w:t>Projection Group masih First angle</w:t>
+            </w:r>
+          </w:p>
+        </w:tc>
+        <w:tc>
+          <w:tcPr>
+            <w:tcW w:type="dxa" w:w="2929"/>
+          </w:tcPr>
+          <w:p>
+            <w:pPr>
+              <w:spacing w:after="0"/>
+            </w:pPr>
+            <w:r>
+              <w:rPr>
+                <w:rFonts w:ascii="Arial" w:hAnsi="Arial" w:eastAsia="Arial" w:cs="Arial"/>
+                <w:b w:val="0"/>
+                <w:i w:val="0"/>
+                <w:sz w:val="18"/>
+              </w:rPr>
+              <w:t>Projection → Third angle, dan pakai template bersimbol sudut ketiga</w:t>
             </w:r>
           </w:p>
         </w:tc>

</xml_diff>

<commit_message>
feat(cad): video Modul 14 versi klik GUI + teks praktik sesuai rekaman (#1053)
- Video praktik terbimbing Modul 14 direkam ulang dengan klik GUI asli
  (23:11, 9 klip, delapan langkah): rumusan dan alias Spreadsheet, model
  parametrik terikat ekspresi, tinggi dari kendala, sapuan, alternatif,
  matriks keputusan, desain pemenang profil I, dan gambar kerja TechDraw
  proyeksi sudut ketiga 1 : 4 + PDF.
- Teks Bagian 09 menjadi delapan langkah sesuai rekaman; langkah 6 memuat
  dasar tiap tanda +1/0/−1 terhadap datum baja pejal; langkah 8 memakai
  template A4_Landscape_ISO5457_sudut_ketiga.svg; tabel gejala ditambah
  jebakan rekaman (Merge Cells, daftar Constraints, Pocket Symmetric,
  Third angle).
- Gambar 7 diberi pita penampang desain B (profil I 100 × 58, flens 16,
  badan 8) beserta ringkasan massa, jejak CO₂, dan lendutan.
- Poster, bab video, Modul-Word/PDF, dan PDF gabungan CAD diperbarui.

Co-authored-by: Claude Opus 5.5 <noreply@anthropic.com>
</commit_message>
<xml_diff>
--- a/Pemodelan-Computer-Aided-Design/Modul-Word/Modul-14-Optimasi-Desain-untuk-Efisiensi-dan-Lingkungan.docx
+++ b/Pemodelan-Computer-Aided-Design/Modul-Word/Modul-14-Optimasi-Desain-untuk-Efisiensi-dan-Lingkungan.docx
@@ -15115,7 +15115,7 @@
           <w:i w:val="0"/>
           <w:sz w:val="22"/>
         </w:rPr>
-        <w:t>Tujuh langkah berikut menjalankan satu putaran optimasi utuh pada lengan braket rak: merumuskan masalah, membangun model parametrik, menghitung tinggi dari kendala, menyapu parameter, membandingkan tiga alternatif, menyusun matriks keputusan, dan mendokumentasikannya di TechDraw.</w:t>
+        <w:t>Delapan langkah berikut menjalankan satu putaran optimasi utuh pada lengan braket rak: merumuskan masalah, membangun model parametrik, menghitung tinggi dari kendala, menyapu parameter, membandingkan tiga alternatif, menyusun matriks keputusan, memodelkan desain pemenang (profil I), lalu mendokumentasikannya dalam gambar kerja sudut ketiga.</w:t>
       </w:r>
     </w:p>
     <w:p>
@@ -15127,7 +15127,7 @@
       <w:r>
         <w:drawing>
           <wp:inline xmlns:a="http://schemas.openxmlformats.org/drawingml/2006/main" xmlns:pic="http://schemas.openxmlformats.org/drawingml/2006/picture">
-            <wp:extent cx="5400000" cy="2955850"/>
+            <wp:extent cx="5400000" cy="4067867"/>
             <wp:docPr id="1858245154" name="Picture 1858245154"/>
             <wp:cNvGraphicFramePr>
               <a:graphicFrameLocks noChangeAspect="1"/>
@@ -15148,7 +15148,7 @@
                   <pic:spPr>
                     <a:xfrm>
                       <a:off x="0" y="0"/>
-                      <a:ext cx="5400000" cy="2955850"/>
+                      <a:ext cx="5400000" cy="4067867"/>
                     </a:xfrm>
                     <a:prstGeom prst="rect"/>
                   </pic:spPr>
@@ -15171,7 +15171,7 @@
           <w:i w:val="0"/>
           <w:sz w:val="20"/>
         </w:rPr>
-        <w:t>Gambar 7 — Gambar kerja lengan braket kantilever dengan variabel desain h. Ukuran dalam mm, gaya dalam N. Lengan pejal b × h × L dijepit pada bidang Sketch YZ dan memikul F = 4.000 N di ujung bebas dengan kendala lendutan ujung δ ≤ 1,5 (langkah 1); penampangnya adalah sketsa b × h pada langkah 2. Tinggi h adalah variabel desain: dihitung dari kendala pada langkah 3, disapu 30–90 pada langkah 4, dan dibatasi ruang pasang h ≤ 90. Catatan memuat alias, rumus, dan angka alternatif yang diketik pada langkah 1–6.</w:t>
+        <w:t>Gambar 7 — Gambar kerja lengan braket kantilever dengan variabel desain h. Ukuran dalam mm, gaya dalam N. Lengan pejal b × h × L dijepit pada bidang Sketch YZ dan memikul F = 4.000 N di ujung bebas dengan kendala lendutan ujung δ ≤ 1,5 (langkah 1); penampangnya adalah sketsa b × h pada langkah 2. Tinggi h adalah variabel desain: dihitung dari kendala pada langkah 3, disapu 30–90 pada langkah 4, dan dibatasi ruang pasang h ≤ 90. Catatan memuat alias, rumus, dan angka alternatif yang diketik pada langkah 1–6. Pita bawah: penampang desain B (profil I 100 × 58, flens 16, badan 8) yang dimodelkan pada langkah 7 dan digambar dalam proyeksi sudut ketiga pada langkah 8.</w:t>
       </w:r>
     </w:p>
     <w:p>
@@ -15204,7 +15204,7 @@
           <w:i w:val="0"/>
           <w:sz w:val="22"/>
         </w:rPr>
-        <w:t>Tulis di lembar pertama Spreadsheet: fungsi tujuan (massa dan jejak CO₂ lengan braket), variabel desain (material dan tinggi h), kendala (δ ≤ 1,5 mm pada F = 4.000 N, L = 700 mm, b = 100 mm), serta batas variabel (h ≤ 90 mm karena ruang pasang). Beri alias gaya, L, b, d_izin, E, rho, f_co2 (bukan F: FreeCAD menolak alias yang sama dengan satuan, mis. F, t, h, A).</w:t>
+        <w:t>File → New Document; workbench Spreadsheet → New Spreadsheet, klik ganda untuk membuka. Baris 1–4 untuk rumusan: klik A1, Shift+klik H1 → Spreadsheet → Merge Cells (teks sel tidak meluap ke sel sebelah), lalu tulis tujuan (minimumkan massa dan jejak CO₂ lengan braket); ulangi untuk variabel desain (material dan tinggi penampang h, b tetap), kendala (lendutan ujung ≤ 1,5 mm pada F 4.000 N, L 700, b 100), dan batas variabel (tinggi ≤ 90 mm karena ruang pasang). A6–A13: gaya, L, b, d_izin, E, rho, f_co2, tinggi; B6–B13: 4000, 700, 100, 1.5, 210000, 7850 (kg/m³), 2, 60 (nilai awal tinggi; sel memakai titik desimal). Pilih tiap sel B → kotak Alias: nama di kolom A (bukan F, t, h, atau A: FreeCAD menolak alias yang sama dengan satuan).</w:t>
       </w:r>
     </w:p>
     <w:p>
@@ -15237,7 +15237,25 @@
           <w:i w:val="0"/>
           <w:sz w:val="22"/>
         </w:rPr>
-        <w:t>Body baru: Sketch YZ persegi panjang b × h dengan kedua konstrain terikat ekspresi =Spreadsheet.b dan =Spreadsheet.tinggi, lalu Pad =Spreadsheet.L. Pastikan sketsa fully constrained dan nilai konstrain berwarna biru.</w:t>
+        <w:t xml:space="preserve">Tab 3D, workbench Part Design → New Body; Sketch → New Sketch → YZ-plane; Rectangle dengan </w:t>
+      </w:r>
+      <w:r>
+        <w:rPr>
+          <w:rFonts w:ascii="Arial" w:hAnsi="Arial" w:eastAsia="Arial" w:cs="Arial"/>
+          <w:b w:val="0"/>
+          <w:i/>
+          <w:sz w:val="22"/>
+        </w:rPr>
+        <w:t>on-view parameters</w:t>
+      </w:r>
+      <w:r>
+        <w:rPr>
+          <w:rFonts w:ascii="Arial" w:hAnsi="Arial" w:eastAsia="Arial" w:cs="Arial"/>
+          <w:b w:val="0"/>
+          <w:i w:val="0"/>
+          <w:sz w:val="22"/>
+        </w:rPr>
+        <w:t>: sudut −50, 0 lalu 100 × 60. Di daftar Constraints, klik ganda konstrain (100 mm) → ketik = lalu Spreadsheet.b; konstrain (60 mm) → Spreadsheet.tinggi. Sketsa tetap fully constrained dan kedua nilainya terikat ekspresi. Close → Pad, kotak Length: =Spreadsheet.L → OK: volume 4.200.000 mm³.</w:t>
       </w:r>
     </w:p>
     <w:p>
@@ -15270,7 +15288,7 @@
           <w:i w:val="0"/>
           <w:sz w:val="22"/>
         </w:rPr>
-        <w:t>Tambahkan sel beralias tinggi = =(4*gaya*L^3/(E*b*d_izin))^(1/3) (sel yang dirujuk konstrain langkah 2; aliasnya bukan h), lalu massa = =rho*b*L*tinggi*1e-9 (kg; rho dalam kg/m³) dan co2 = =f_co2*massa. Ctrl+R, cocokkan massa dengan Body.Shape.Volume × rho × 10⁻⁹ di Python console (bukan di sel, agar tidak melingkar), dan catat sebagai iterasi 0 (datum) baja.</w:t>
+        <w:t>Tab Spreadsheet: B13 (alias tinggi) diganti =(4*gaya*L^3/(E*b*d_izin))^(1/3); A14 massa, B14 =rho*b*L*tinggi*1e-9 (kg); A15 co2, B15 =f_co2*massa; beri alias massa dan co2 → Refresh (Ctrl+R): tinggi 55,851 mm, massa 30,69 kg, co2 61,38 kg. Pad ikut menipis karena konstrainnya membaca sel tinggi. Tab 3D, Python console: round(App.ActiveDocument.Body.Shape.Volume) = 3.909.602 mm³ dan round(App.ActiveDocument.Body.Shape.Volume * 7850e-9, 2) = 30,69 kg, sama dengan sel massa (dibaca di konsol, bukan di sel, agar tidak melingkar). Catat sebagai iterasi 0 (datum) baja.</w:t>
       </w:r>
     </w:p>
     <w:p>
@@ -15303,7 +15321,7 @@
           <w:i w:val="0"/>
           <w:sz w:val="22"/>
         </w:rPr>
-        <w:t>Jalankan cell kedua Bagian 08 dengan angka kasus ini untuk menyapu h dari 30 sampai 90 mm; tandai h terkecil yang masih memenuhi δ ≤ 1,5 mm dan cocokkan dengan nilai sel tinggi. Selisih di atas 0,5 % berarti ada satuan yang salah.</w:t>
+        <w:t>Konsol: [(h, round(4*4000*700**3/(210000*100*h**3), 3)) for h in range(30, 91) if 4*4000*700**3/(210000*100*h**3) &lt;= 1.5][0] → (56, 1.488): h bulat terkecil dalam rentang 30–90 mm yang memenuhi δ ≤ 1,5 mm (rumus sapuan cell kedua Bagian 08 dengan angka kasus ini). Cocokkan dengan sel: t = App.ActiveDocument.Spreadsheet.tinggi, lalu round(100 * 56 / t - 100, 2) = 0,27 %, di bawah 0,5 %. Selisih yang lebih besar berarti ada satuan yang salah.</w:t>
       </w:r>
     </w:p>
     <w:p>
@@ -15336,7 +15354,7 @@
           <w:i w:val="0"/>
           <w:sz w:val="22"/>
         </w:rPr>
-        <w:t>Kolom kedua Spreadsheet: aluminium (E 70.000, ρ 2.700, f 12,0). Kolom ketiga: baja berusuk dengan massa 60 % pelat pejal pada I setara. Hitung h, massa, dan CO₂ ketiganya berdampingan.</w:t>
+        <w:t>Tab Spreadsheet, baris 17–21: h_al =(4*gaya*L^3/(70000*b*d_izin))^(1/3) = 80,55 mm; m_al =2700*b*L*B17*1e-9 = 15,22 kg; co2_al =12*B18 = 182,69 kg; m_rusuk =0.6*massa = 18,41 kg (baja berusuk: 60 % pelat pejal pada I setara); co2_rusuk =f_co2*B20 = 36,83 kg. Ketiga alternatif kini berdampingan dengan datum baja pejal.</w:t>
       </w:r>
     </w:p>
     <w:p>
@@ -15369,7 +15387,7 @@
           <w:i w:val="0"/>
           <w:sz w:val="22"/>
         </w:rPr>
-        <w:t>Lembar kedua: lima kriteria dengan bobot 0,25 / 0,25 / 0,20 / 0,15 / 0,15, nilai −1, 0, +1 terhadap datum baja pejal, lalu skor berbobot Persamaan (6). Tulis satu kalimat alasan untuk setiap tanda − yang diberikan.</w:t>
+        <w:t>Spreadsheet baru, F2 → Matriks, klik ganda. A1–D1: kriteria, bobot, B_rusuk, C_al; baris 2–6: massa 0,25 (1, 1), co2 0,25 (1, −1), biaya 0,20 (−1, −1), buat 0,15 (−1, 0), tinggi 0,15 (0, −1) terhadap datum baja pejal (bobot diketik dengan titik desimal). Dasar tanda (+1 lebih baik, 0 setara, −1 lebih buruk daripada datum A; bobot dari Bagian 05): massa — B 18,41 kg dan C 15,22 kg lebih ringan daripada 30,69 kg (+1, +1); CO₂ — B 36,83 kg di bawah 61,38 kg (+1), C 182,69 kg di atasnya (−1); biaya bahan + proses — rusuk B butuh las/pemesinan, aluminium C lebih mahal per kg (−1, −1); kemudahan pembuatan — B menambah satu operasi las (−1), C tetap satu pelat pejal seperti A (0); tinggi terpasang — B setinggi datum 55,85 mm (0), C 80,55 mm mendekati batas ruang pasang 90 mm (−1). A7 skor; C7 =B2*C2+B3*C3+B4*C4+B5*C5+B6*C6 = 0,15 dan D7 dengan kolom D = −0,35 (Persamaan 6). Baris 9: Merge Cells A9:H9, lalu tulis alasannya: “Pemenang: B baja berusuk (+0,15); C kalah pada CO2, biaya, dan tinggi terpasang”.</w:t>
       </w:r>
     </w:p>
     <w:p>
@@ -15393,16 +15411,139 @@
           <w:i w:val="0"/>
           <w:sz w:val="22"/>
         </w:rPr>
-        <w:t xml:space="preserve">Dokumentasikan dan simpan: </w:t>
-      </w:r>
-      <w:r>
-        <w:rPr>
-          <w:rFonts w:ascii="Arial" w:hAnsi="Arial" w:eastAsia="Arial" w:cs="Arial"/>
-          <w:b w:val="0"/>
-          <w:i w:val="0"/>
-          <w:sz w:val="22"/>
-        </w:rPr>
-        <w:t>TechDraw: Page + tiga pandangan desain pemenang (untuk B, misalnya profil I tinggi 58, flens 100 × 16, badan 8 mm: I ≥ pejal, massa ±61 %), dimensi pada h dan b, catatan berisi massa, jejak CO₂, dan faktor emisi yang dipakai. Ctrl+S → Latihan14_NIM.FCStd.</w:t>
+        <w:t xml:space="preserve">Modelkan desain pemenang: </w:t>
+      </w:r>
+      <w:r>
+        <w:rPr>
+          <w:rFonts w:ascii="Arial" w:hAnsi="Arial" w:eastAsia="Arial" w:cs="Arial"/>
+          <w:b w:val="0"/>
+          <w:i w:val="0"/>
+          <w:sz w:val="22"/>
+        </w:rPr>
+        <w:t xml:space="preserve">Tab 3D, sembunyikan Body (Space); Part Design → New Body, F2 → LenganB. Sketch YZ: Rectangle −50, 0 ukuran 100 × 58 → Pad 700. Sketch YZ kedua: dua Rectangle mulai 4, 16 dan −50, 16, masing-masing 46 × 26 (flens 16, badan 8) → Pocket, Type </w:t>
+      </w:r>
+      <w:r>
+        <w:rPr>
+          <w:rFonts w:ascii="Arial" w:hAnsi="Arial" w:eastAsia="Arial" w:cs="Arial"/>
+          <w:b w:val="0"/>
+          <w:i/>
+          <w:sz w:val="22"/>
+        </w:rPr>
+        <w:t>Through all</w:t>
+      </w:r>
+      <w:r>
+        <w:rPr>
+          <w:rFonts w:ascii="Arial" w:hAnsi="Arial" w:eastAsia="Arial" w:cs="Arial"/>
+          <w:b w:val="0"/>
+          <w:i w:val="0"/>
+          <w:sz w:val="22"/>
+        </w:rPr>
+        <w:t xml:space="preserve">, mode </w:t>
+      </w:r>
+      <w:r>
+        <w:rPr>
+          <w:rFonts w:ascii="Arial" w:hAnsi="Arial" w:eastAsia="Arial" w:cs="Arial"/>
+          <w:b w:val="0"/>
+          <w:i/>
+          <w:sz w:val="22"/>
+        </w:rPr>
+        <w:t>Symmetric</w:t>
+      </w:r>
+      <w:r>
+        <w:rPr>
+          <w:rFonts w:ascii="Arial" w:hAnsi="Arial" w:eastAsia="Arial" w:cs="Arial"/>
+          <w:b w:val="0"/>
+          <w:i w:val="0"/>
+          <w:sz w:val="22"/>
+        </w:rPr>
+        <w:t xml:space="preserve"> (sketsa berada di pangkal Pad). Konsol: v = App.ActiveDocument.getObjectsByLabel('LenganB')[0].Shape.Volume; round(v) = 2.385.600 mm³; massa 18,73 kg dan jejak 37,45 kg CO₂, 61 % pelat pejal; lendutan round(4 * 4000 * 700**3 / (210000 * (100 * 58**3 - 92 * 26**3)), 2) = 1,46 mm ≤ 1,5 mm.</w:t>
+      </w:r>
+    </w:p>
+    <w:p>
+      <w:pPr>
+        <w:spacing w:line="360" w:lineRule="auto" w:after="60"/>
+        <w:ind w:left="425" w:hanging="227"/>
+      </w:pPr>
+      <w:r>
+        <w:rPr>
+          <w:rFonts w:ascii="Arial" w:hAnsi="Arial" w:eastAsia="Arial" w:cs="Arial"/>
+          <w:b w:val="0"/>
+          <w:i w:val="0"/>
+          <w:sz w:val="22"/>
+        </w:rPr>
+        <w:t xml:space="preserve">•  </w:t>
+      </w:r>
+      <w:r>
+        <w:rPr>
+          <w:rFonts w:ascii="Arial" w:hAnsi="Arial" w:eastAsia="Arial" w:cs="Arial"/>
+          <w:b/>
+          <w:i w:val="0"/>
+          <w:sz w:val="22"/>
+        </w:rPr>
+        <w:t xml:space="preserve">Gambar kerja sudut ketiga dan simpan: </w:t>
+      </w:r>
+      <w:r>
+        <w:rPr>
+          <w:rFonts w:ascii="Arial" w:hAnsi="Arial" w:eastAsia="Arial" w:cs="Arial"/>
+          <w:b w:val="0"/>
+          <w:i w:val="0"/>
+          <w:sz w:val="22"/>
+        </w:rPr>
+        <w:t xml:space="preserve">Workbench TechDraw → Page → New Page From Template → A4_Landscape_ISO5457_sudut_ketiga.svg (template ISO A4 dengan simbol sudut ketiga; unduh dulu). Pilih LenganB → TechDraw Views → </w:t>
+      </w:r>
+      <w:r>
+        <w:rPr>
+          <w:rFonts w:ascii="Arial" w:hAnsi="Arial" w:eastAsia="Arial" w:cs="Arial"/>
+          <w:b/>
+          <w:i w:val="0"/>
+          <w:sz w:val="22"/>
+        </w:rPr>
+        <w:t>Projection Group</w:t>
+      </w:r>
+      <w:r>
+        <w:rPr>
+          <w:rFonts w:ascii="Arial" w:hAnsi="Arial" w:eastAsia="Arial" w:cs="Arial"/>
+          <w:b w:val="0"/>
+          <w:i w:val="0"/>
+          <w:sz w:val="22"/>
+        </w:rPr>
+        <w:t xml:space="preserve">: tombol Front (arah depan dokumen), Projection </w:t>
+      </w:r>
+      <w:r>
+        <w:rPr>
+          <w:rFonts w:ascii="Arial" w:hAnsi="Arial" w:eastAsia="Arial" w:cs="Arial"/>
+          <w:b w:val="0"/>
+          <w:i/>
+          <w:sz w:val="22"/>
+        </w:rPr>
+        <w:t>Third angle</w:t>
+      </w:r>
+      <w:r>
+        <w:rPr>
+          <w:rFonts w:ascii="Arial" w:hAnsi="Arial" w:eastAsia="Arial" w:cs="Arial"/>
+          <w:b w:val="0"/>
+          <w:i w:val="0"/>
+          <w:sz w:val="22"/>
+        </w:rPr>
+        <w:t xml:space="preserve">, centang Top dan Right, Scale Custom 1 : 4, X/Y spacing 25 → OK; ProjGroup Data X 122, Y 122: Atas di atas Depan, Kanan di kanan Depan. Dimensi, semua 12 mm dari benda: tepi bawah Depan → Length Dimension 700 (seret ke bawah); tepi atas Kanan → Length Dimension 100 (ke atas); dua titik sudut kanan pandangan Kanan (Ctrl+klik) → Vertical Length Dimension 58 (ke kanan). Kepala gambar: Title “Lengan Braket Desain B”, Created by (nama dan NIM Anda), Approved by (nama dosen pengampu), Document type “Gambar Kerja”, Part Material “Baja S275JR”, Scale “1 : 4”. Annotations → </w:t>
+      </w:r>
+      <w:r>
+        <w:rPr>
+          <w:rFonts w:ascii="Arial" w:hAnsi="Arial" w:eastAsia="Arial" w:cs="Arial"/>
+          <w:b/>
+          <w:i w:val="0"/>
+          <w:sz w:val="22"/>
+        </w:rPr>
+        <w:t>Text Annotation</w:t>
+      </w:r>
+      <w:r>
+        <w:rPr>
+          <w:rFonts w:ascii="Arial" w:hAnsi="Arial" w:eastAsia="Arial" w:cs="Arial"/>
+          <w:b w:val="0"/>
+          <w:i w:val="0"/>
+          <w:sz w:val="22"/>
+        </w:rPr>
+        <w:t>: Data Text Size 3,5, X 101,5, Y 80; klik ganda teksnya → tulis CATATAN: profil dan lendutan, massa, serta jejak CO₂ dengan faktor emisi baja → OK. Ctrl+S → Latihan14_NIM.FCStd; File → Export PDF → Latihan14_NIM.pdf.</w:t>
       </w:r>
     </w:p>
     <w:p>
@@ -15491,6 +15632,242 @@
                 <w:sz w:val="18"/>
               </w:rPr>
               <w:t>Perbaikan</w:t>
+            </w:r>
+          </w:p>
+        </w:tc>
+      </w:tr>
+      <w:tr>
+        <w:tc>
+          <w:tcPr>
+            <w:tcW w:type="dxa" w:w="2929"/>
+          </w:tcPr>
+          <w:p>
+            <w:pPr>
+              <w:spacing w:after="0"/>
+            </w:pPr>
+            <w:r>
+              <w:rPr>
+                <w:rFonts w:ascii="Arial" w:hAnsi="Arial" w:eastAsia="Arial" w:cs="Arial"/>
+                <w:b w:val="0"/>
+                <w:i w:val="0"/>
+                <w:sz w:val="18"/>
+              </w:rPr>
+              <w:t>Teks rumusan di A1 terpotong</w:t>
+            </w:r>
+          </w:p>
+        </w:tc>
+        <w:tc>
+          <w:tcPr>
+            <w:tcW w:type="dxa" w:w="2929"/>
+          </w:tcPr>
+          <w:p>
+            <w:pPr>
+              <w:spacing w:after="0"/>
+            </w:pPr>
+            <w:r>
+              <w:rPr>
+                <w:rFonts w:ascii="Arial" w:hAnsi="Arial" w:eastAsia="Arial" w:cs="Arial"/>
+                <w:b w:val="0"/>
+                <w:i w:val="0"/>
+                <w:sz w:val="18"/>
+              </w:rPr>
+              <w:t>Teks sel Spreadsheet tidak meluap ke sel sebelah</w:t>
+            </w:r>
+          </w:p>
+        </w:tc>
+        <w:tc>
+          <w:tcPr>
+            <w:tcW w:type="dxa" w:w="2929"/>
+          </w:tcPr>
+          <w:p>
+            <w:pPr>
+              <w:spacing w:after="0"/>
+            </w:pPr>
+            <w:r>
+              <w:rPr>
+                <w:rFonts w:ascii="Arial" w:hAnsi="Arial" w:eastAsia="Arial" w:cs="Arial"/>
+                <w:b w:val="0"/>
+                <w:i w:val="0"/>
+                <w:sz w:val="18"/>
+              </w:rPr>
+              <w:t>Pilih A1:H1 → Spreadsheet → Merge Cells sebelum mengetik</w:t>
+            </w:r>
+          </w:p>
+        </w:tc>
+      </w:tr>
+      <w:tr>
+        <w:tc>
+          <w:tcPr>
+            <w:tcW w:type="dxa" w:w="2929"/>
+          </w:tcPr>
+          <w:p>
+            <w:pPr>
+              <w:spacing w:after="0"/>
+            </w:pPr>
+            <w:r>
+              <w:rPr>
+                <w:rFonts w:ascii="Arial" w:hAnsi="Arial" w:eastAsia="Arial" w:cs="Arial"/>
+                <w:b w:val="0"/>
+                <w:i w:val="0"/>
+                <w:sz w:val="18"/>
+              </w:rPr>
+              <w:t>Klik ganda konstrain tidak membuka kotak nilai</w:t>
+            </w:r>
+          </w:p>
+        </w:tc>
+        <w:tc>
+          <w:tcPr>
+            <w:tcW w:type="dxa" w:w="2929"/>
+          </w:tcPr>
+          <w:p>
+            <w:pPr>
+              <w:spacing w:after="0"/>
+            </w:pPr>
+            <w:r>
+              <w:rPr>
+                <w:rFonts w:ascii="Arial" w:hAnsi="Arial" w:eastAsia="Arial" w:cs="Arial"/>
+                <w:b w:val="0"/>
+                <w:i w:val="0"/>
+                <w:sz w:val="18"/>
+              </w:rPr>
+              <w:t>Baris konstrain di daftar Constraints belum terlihat</w:t>
+            </w:r>
+          </w:p>
+        </w:tc>
+        <w:tc>
+          <w:tcPr>
+            <w:tcW w:type="dxa" w:w="2929"/>
+          </w:tcPr>
+          <w:p>
+            <w:pPr>
+              <w:spacing w:after="0"/>
+            </w:pPr>
+            <w:r>
+              <w:rPr>
+                <w:rFonts w:ascii="Arial" w:hAnsi="Arial" w:eastAsia="Arial" w:cs="Arial"/>
+                <w:b w:val="0"/>
+                <w:i w:val="0"/>
+                <w:sz w:val="18"/>
+              </w:rPr>
+              <w:t>Gulir daftar Constraints sampai baris (100 mm) atau (60 mm) tampak, lalu klik ganda</w:t>
+            </w:r>
+          </w:p>
+        </w:tc>
+      </w:tr>
+      <w:tr>
+        <w:tc>
+          <w:tcPr>
+            <w:tcW w:type="dxa" w:w="2929"/>
+          </w:tcPr>
+          <w:p>
+            <w:pPr>
+              <w:spacing w:after="0"/>
+            </w:pPr>
+            <w:r>
+              <w:rPr>
+                <w:rFonts w:ascii="Arial" w:hAnsi="Arial" w:eastAsia="Arial" w:cs="Arial"/>
+                <w:b w:val="0"/>
+                <w:i w:val="0"/>
+                <w:sz w:val="18"/>
+              </w:rPr>
+              <w:t>Pocket profil I tidak memotong apa pun</w:t>
+            </w:r>
+          </w:p>
+        </w:tc>
+        <w:tc>
+          <w:tcPr>
+            <w:tcW w:type="dxa" w:w="2929"/>
+          </w:tcPr>
+          <w:p>
+            <w:pPr>
+              <w:spacing w:after="0"/>
+            </w:pPr>
+            <w:r>
+              <w:rPr>
+                <w:rFonts w:ascii="Arial" w:hAnsi="Arial" w:eastAsia="Arial" w:cs="Arial"/>
+                <w:b w:val="0"/>
+                <w:i w:val="0"/>
+                <w:sz w:val="18"/>
+              </w:rPr>
+              <w:t>Sketsa di pangkal Pad, sedangkan Pocket memotong ke arah luar</w:t>
+            </w:r>
+          </w:p>
+        </w:tc>
+        <w:tc>
+          <w:tcPr>
+            <w:tcW w:type="dxa" w:w="2929"/>
+          </w:tcPr>
+          <w:p>
+            <w:pPr>
+              <w:spacing w:after="0"/>
+            </w:pPr>
+            <w:r>
+              <w:rPr>
+                <w:rFonts w:ascii="Arial" w:hAnsi="Arial" w:eastAsia="Arial" w:cs="Arial"/>
+                <w:b w:val="0"/>
+                <w:i w:val="0"/>
+                <w:sz w:val="18"/>
+              </w:rPr>
+              <w:t>Type Through all dengan mode Symmetric (atau Reversed)</w:t>
+            </w:r>
+          </w:p>
+        </w:tc>
+      </w:tr>
+      <w:tr>
+        <w:tc>
+          <w:tcPr>
+            <w:tcW w:type="dxa" w:w="2929"/>
+          </w:tcPr>
+          <w:p>
+            <w:pPr>
+              <w:spacing w:after="0"/>
+            </w:pPr>
+            <w:r>
+              <w:rPr>
+                <w:rFonts w:ascii="Arial" w:hAnsi="Arial" w:eastAsia="Arial" w:cs="Arial"/>
+                <w:b w:val="0"/>
+                <w:i w:val="0"/>
+                <w:sz w:val="18"/>
+              </w:rPr>
+              <w:t>Pandangan Atas berada di bawah Depan</w:t>
+            </w:r>
+          </w:p>
+        </w:tc>
+        <w:tc>
+          <w:tcPr>
+            <w:tcW w:type="dxa" w:w="2929"/>
+          </w:tcPr>
+          <w:p>
+            <w:pPr>
+              <w:spacing w:after="0"/>
+            </w:pPr>
+            <w:r>
+              <w:rPr>
+                <w:rFonts w:ascii="Arial" w:hAnsi="Arial" w:eastAsia="Arial" w:cs="Arial"/>
+                <w:b w:val="0"/>
+                <w:i w:val="0"/>
+                <w:sz w:val="18"/>
+              </w:rPr>
+              <w:t>Projection Group masih First angle</w:t>
+            </w:r>
+          </w:p>
+        </w:tc>
+        <w:tc>
+          <w:tcPr>
+            <w:tcW w:type="dxa" w:w="2929"/>
+          </w:tcPr>
+          <w:p>
+            <w:pPr>
+              <w:spacing w:after="0"/>
+            </w:pPr>
+            <w:r>
+              <w:rPr>
+                <w:rFonts w:ascii="Arial" w:hAnsi="Arial" w:eastAsia="Arial" w:cs="Arial"/>
+                <w:b w:val="0"/>
+                <w:i w:val="0"/>
+                <w:sz w:val="18"/>
+              </w:rPr>
+              <w:t>Projection → Third angle, dan pakai template bersimbol sudut ketiga</w:t>
             </w:r>
           </w:p>
         </w:tc>

</xml_diff>